<commit_message>
feat: browser-first Vercel/Aiven deployment and protected satellite analysis workflow
</commit_message>
<xml_diff>
--- a/deliverables/01_Software_Requirements_Specification.docx
+++ b/deliverables/01_Software_Requirements_Specification.docx
@@ -74,7 +74,7 @@
         <w:rPr>
           <w:b/>
         </w:rPr>
-        <w:t>VERSION 1.0 • IMPLEMENTATION BASELINE</w:t>
+        <w:t>RELEASE DOCUMENTATION • OCTOBER 2026</w:t>
       </w:r>
     </w:p>
     <w:p>
@@ -969,6 +969,59 @@
         <w:t>This document is an engineering baseline rather than a claim that all requirements have passed acceptance testing. Sign-off fields: Product owner __________; supervisor __________; date __________.</w:t>
       </w:r>
     </w:p>
+    <w:p>
+      <w:pPr>
+        <w:pStyle w:val="Heading2"/>
+      </w:pPr>
+      <w:r>
+        <w:t>v0.2 deployment usability requirements</w:t>
+      </w:r>
+    </w:p>
+    <w:p>
+      <w:pPr>
+        <w:pStyle w:val="ListBullet"/>
+        <w:ind w:left="360"/>
+      </w:pPr>
+      <w:r>
+        <w:t>The operator shall be able to use Vercel, Aiven and GitHub web dashboards without any mandatory terminal setup commands.</w:t>
+      </w:r>
+    </w:p>
+    <w:p>
+      <w:pPr>
+        <w:pStyle w:val="ListBullet"/>
+        <w:ind w:left="360"/>
+      </w:pPr>
+      <w:r>
+        <w:t>The web setup assistant shall provide links to vendor dashboards, show copyable canonical SQL, generate a strong local browser key and display non-sensitive readiness diagnostics.</w:t>
+      </w:r>
+    </w:p>
+    <w:p>
+      <w:pPr>
+        <w:pStyle w:val="ListBullet"/>
+        <w:ind w:left="360"/>
+      </w:pPr>
+      <w:r>
+        <w:t>The satellite imagery page shall present GitHub Actions form inputs rather than command-line invocation instructions.</w:t>
+      </w:r>
+    </w:p>
+    <w:p>
+      <w:pPr>
+        <w:pStyle w:val="ListBullet"/>
+        <w:ind w:left="360"/>
+      </w:pPr>
+      <w:r>
+        <w:t>The analysis worker shall privately import records using secrets, avoiding public artifacts containing sensitive geometry; the publicly visible GitHub inputs may be used only for non-sensitive study areas.</w:t>
+      </w:r>
+    </w:p>
+    <w:p>
+      <w:pPr>
+        <w:pStyle w:val="ListBullet"/>
+        <w:ind w:left="360"/>
+      </w:pPr>
+      <w:r>
+        <w:t>The API shall reject malformed polygon rings, prevent duplicate candidate inserts, and ensure every new candidate starts unverified.</w:t>
+      </w:r>
+    </w:p>
     <w:sectPr>
       <w:headerReference w:type="default" r:id="rId9"/>
       <w:footerReference w:type="default" r:id="rId10"/>

</xml_diff>